<commit_message>
feat(matrices): completa cierre técnico fase 12.5.5
</commit_message>
<xml_diff>
--- a/docs/3. Módulo Matrices de Riesgos/Fase 12 - Mejora ejecutiva UXUI y mapa de calor/Cierre_Tecnico_Fase_12_Matrices_Riesgos_SGRLA_IHSS.docx
+++ b/docs/3. Módulo Matrices de Riesgos/Fase 12 - Mejora ejecutiva UXUI y mapa de calor/Cierre_Tecnico_Fase_12_Matrices_Riesgos_SGRLA_IHSS.docx
@@ -12630,6 +12630,768 @@
         <w:t>FIN DEL DOCUMENTO</w:t>
       </w:r>
     </w:p>
+    <w:p>
+      <w:r>
+        <w:br w:type="page"/>
+      </w:r>
+    </w:p>
+    <w:p>
+      <w:pPr>
+        <w:spacing w:after="160"/>
+        <w:jc w:val="center"/>
+      </w:pPr>
+      <w:r>
+        <w:rPr>
+          <w:b/>
+          <w:color w:val="123B63"/>
+          <w:sz w:val="36"/>
+        </w:rPr>
+        <w:t>ACTUALIZACIÓN FINAL - FASE 12.5</w:t>
+      </w:r>
+    </w:p>
+    <w:p>
+      <w:pPr>
+        <w:jc w:val="center"/>
+      </w:pPr>
+      <w:r>
+        <w:rPr>
+          <w:b/>
+        </w:rPr>
+        <w:t>Pruebas, evidencia y cierre definitivo del Módulo de Matrices de Riesgos</w:t>
+      </w:r>
+    </w:p>
+    <w:p>
+      <w:r>
+        <w:rPr>
+          <w:b/>
+        </w:rPr>
+        <w:t xml:space="preserve">Estado técnico: </w:t>
+      </w:r>
+      <w:r>
+        <w:t>COMPLETADO - pendiente de aprobación formal e integración autorizada a main.</w:t>
+      </w:r>
+    </w:p>
+    <w:p>
+      <w:pPr>
+        <w:pStyle w:val="Heading1"/>
+        <w:keepNext/>
+      </w:pPr>
+      <w:r>
+        <w:rPr>
+          <w:color w:val="123B63"/>
+        </w:rPr>
+        <w:t>1. Consolidación de subfases</w:t>
+      </w:r>
+    </w:p>
+    <w:tbl>
+      <w:tblPr>
+        <w:tblStyle w:val="TableGrid"/>
+        <w:tblW w:type="auto" w:w="0"/>
+        <w:jc w:val="center"/>
+        <w:tblLook w:firstColumn="1" w:firstRow="1" w:lastColumn="0" w:lastRow="0" w:noHBand="0" w:noVBand="1" w:val="04A0"/>
+      </w:tblPr>
+      <w:tblGrid>
+        <w:gridCol w:w="3389"/>
+        <w:gridCol w:w="3389"/>
+        <w:gridCol w:w="3389"/>
+      </w:tblGrid>
+      <w:tr>
+        <w:trPr>
+          <w:tblHeader w:val="true"/>
+        </w:trPr>
+        <w:tc>
+          <w:tcPr>
+            <w:tcW w:type="dxa" w:w="3389"/>
+            <w:vAlign w:val="center"/>
+            <w:shd w:fill="123B63"/>
+          </w:tcPr>
+          <w:p>
+            <w:r/>
+            <w:r>
+              <w:rPr>
+                <w:b/>
+                <w:color w:val="FFFFFF"/>
+                <w:sz w:val="18"/>
+              </w:rPr>
+              <w:t>Subfase</w:t>
+            </w:r>
+          </w:p>
+        </w:tc>
+        <w:tc>
+          <w:tcPr>
+            <w:tcW w:type="dxa" w:w="3389"/>
+            <w:vAlign w:val="center"/>
+            <w:shd w:fill="123B63"/>
+          </w:tcPr>
+          <w:p>
+            <w:r/>
+            <w:r>
+              <w:rPr>
+                <w:b/>
+                <w:color w:val="FFFFFF"/>
+                <w:sz w:val="18"/>
+              </w:rPr>
+              <w:t>Resultado</w:t>
+            </w:r>
+          </w:p>
+        </w:tc>
+        <w:tc>
+          <w:tcPr>
+            <w:tcW w:type="dxa" w:w="3389"/>
+            <w:vAlign w:val="center"/>
+            <w:shd w:fill="123B63"/>
+          </w:tcPr>
+          <w:p>
+            <w:r/>
+            <w:r>
+              <w:rPr>
+                <w:b/>
+                <w:color w:val="FFFFFF"/>
+                <w:sz w:val="18"/>
+              </w:rPr>
+              <w:t>Estado</w:t>
+            </w:r>
+          </w:p>
+        </w:tc>
+      </w:tr>
+      <w:tr>
+        <w:tc>
+          <w:tcPr>
+            <w:tcW w:type="dxa" w:w="3389"/>
+            <w:vAlign w:val="center"/>
+          </w:tcPr>
+          <w:p>
+            <w:r/>
+            <w:r>
+              <w:rPr>
+                <w:b w:val="0"/>
+                <w:sz w:val="18"/>
+              </w:rPr>
+              <w:t>12.5.1</w:t>
+            </w:r>
+          </w:p>
+        </w:tc>
+        <w:tc>
+          <w:tcPr>
+            <w:tcW w:type="dxa" w:w="3389"/>
+            <w:vAlign w:val="center"/>
+          </w:tcPr>
+          <w:p>
+            <w:r/>
+            <w:r>
+              <w:rPr>
+                <w:b w:val="0"/>
+                <w:sz w:val="18"/>
+              </w:rPr>
+              <w:t>Estándar institucional compartido para reportería</w:t>
+            </w:r>
+          </w:p>
+        </w:tc>
+        <w:tc>
+          <w:tcPr>
+            <w:tcW w:type="dxa" w:w="3389"/>
+            <w:vAlign w:val="center"/>
+          </w:tcPr>
+          <w:p>
+            <w:r/>
+            <w:r>
+              <w:rPr>
+                <w:b/>
+                <w:sz w:val="18"/>
+              </w:rPr>
+              <w:t>Completa</w:t>
+            </w:r>
+          </w:p>
+        </w:tc>
+      </w:tr>
+      <w:tr>
+        <w:tc>
+          <w:tcPr>
+            <w:tcW w:type="dxa" w:w="3389"/>
+            <w:vAlign w:val="center"/>
+            <w:shd w:fill="F3F6F9"/>
+          </w:tcPr>
+          <w:p>
+            <w:r/>
+            <w:r>
+              <w:rPr>
+                <w:b w:val="0"/>
+                <w:sz w:val="18"/>
+              </w:rPr>
+              <w:t>12.5.2</w:t>
+            </w:r>
+          </w:p>
+        </w:tc>
+        <w:tc>
+          <w:tcPr>
+            <w:tcW w:type="dxa" w:w="3389"/>
+            <w:vAlign w:val="center"/>
+            <w:shd w:fill="F3F6F9"/>
+          </w:tcPr>
+          <w:p>
+            <w:r/>
+            <w:r>
+              <w:rPr>
+                <w:b w:val="0"/>
+                <w:sz w:val="18"/>
+              </w:rPr>
+              <w:t>Normalización de reportería de Monitoreo de Listas</w:t>
+            </w:r>
+          </w:p>
+        </w:tc>
+        <w:tc>
+          <w:tcPr>
+            <w:tcW w:type="dxa" w:w="3389"/>
+            <w:vAlign w:val="center"/>
+            <w:shd w:fill="F3F6F9"/>
+          </w:tcPr>
+          <w:p>
+            <w:r/>
+            <w:r>
+              <w:rPr>
+                <w:b/>
+                <w:sz w:val="18"/>
+              </w:rPr>
+              <w:t>Completa</w:t>
+            </w:r>
+          </w:p>
+        </w:tc>
+      </w:tr>
+      <w:tr>
+        <w:tc>
+          <w:tcPr>
+            <w:tcW w:type="dxa" w:w="3389"/>
+            <w:vAlign w:val="center"/>
+          </w:tcPr>
+          <w:p>
+            <w:r/>
+            <w:r>
+              <w:rPr>
+                <w:b w:val="0"/>
+                <w:sz w:val="18"/>
+              </w:rPr>
+              <w:t>12.5.3</w:t>
+            </w:r>
+          </w:p>
+        </w:tc>
+        <w:tc>
+          <w:tcPr>
+            <w:tcW w:type="dxa" w:w="3389"/>
+            <w:vAlign w:val="center"/>
+          </w:tcPr>
+          <w:p>
+            <w:r/>
+            <w:r>
+              <w:rPr>
+                <w:b w:val="0"/>
+                <w:sz w:val="18"/>
+              </w:rPr>
+              <w:t>Reemplazo de reportería de Matrices de Riesgos</w:t>
+            </w:r>
+          </w:p>
+        </w:tc>
+        <w:tc>
+          <w:tcPr>
+            <w:tcW w:type="dxa" w:w="3389"/>
+            <w:vAlign w:val="center"/>
+          </w:tcPr>
+          <w:p>
+            <w:r/>
+            <w:r>
+              <w:rPr>
+                <w:b/>
+                <w:sz w:val="18"/>
+              </w:rPr>
+              <w:t>Completa</w:t>
+            </w:r>
+          </w:p>
+        </w:tc>
+      </w:tr>
+      <w:tr>
+        <w:tc>
+          <w:tcPr>
+            <w:tcW w:type="dxa" w:w="3389"/>
+            <w:vAlign w:val="center"/>
+            <w:shd w:fill="F3F6F9"/>
+          </w:tcPr>
+          <w:p>
+            <w:r/>
+            <w:r>
+              <w:rPr>
+                <w:b w:val="0"/>
+                <w:sz w:val="18"/>
+              </w:rPr>
+              <w:t>12.5.4</w:t>
+            </w:r>
+          </w:p>
+        </w:tc>
+        <w:tc>
+          <w:tcPr>
+            <w:tcW w:type="dxa" w:w="3389"/>
+            <w:vAlign w:val="center"/>
+            <w:shd w:fill="F3F6F9"/>
+          </w:tcPr>
+          <w:p>
+            <w:r/>
+            <w:r>
+              <w:rPr>
+                <w:b w:val="0"/>
+                <w:sz w:val="18"/>
+              </w:rPr>
+              <w:t>Refinamiento UX, documental, accesibilidad y retiro de /recalcular</w:t>
+            </w:r>
+          </w:p>
+        </w:tc>
+        <w:tc>
+          <w:tcPr>
+            <w:tcW w:type="dxa" w:w="3389"/>
+            <w:vAlign w:val="center"/>
+            <w:shd w:fill="F3F6F9"/>
+          </w:tcPr>
+          <w:p>
+            <w:r/>
+            <w:r>
+              <w:rPr>
+                <w:b/>
+                <w:sz w:val="18"/>
+              </w:rPr>
+              <w:t>Completa</w:t>
+            </w:r>
+          </w:p>
+        </w:tc>
+      </w:tr>
+      <w:tr>
+        <w:tc>
+          <w:tcPr>
+            <w:tcW w:type="dxa" w:w="3389"/>
+            <w:vAlign w:val="center"/>
+          </w:tcPr>
+          <w:p>
+            <w:r/>
+            <w:r>
+              <w:rPr>
+                <w:b w:val="0"/>
+                <w:sz w:val="18"/>
+              </w:rPr>
+              <w:t>12.5.5</w:t>
+            </w:r>
+          </w:p>
+        </w:tc>
+        <w:tc>
+          <w:tcPr>
+            <w:tcW w:type="dxa" w:w="3389"/>
+            <w:vAlign w:val="center"/>
+          </w:tcPr>
+          <w:p>
+            <w:r/>
+            <w:r>
+              <w:rPr>
+                <w:b w:val="0"/>
+                <w:sz w:val="18"/>
+              </w:rPr>
+              <w:t>Pruebas con archivos reales, evidencia y cierre</w:t>
+            </w:r>
+          </w:p>
+        </w:tc>
+        <w:tc>
+          <w:tcPr>
+            <w:tcW w:type="dxa" w:w="3389"/>
+            <w:vAlign w:val="center"/>
+          </w:tcPr>
+          <w:p>
+            <w:r/>
+            <w:r>
+              <w:rPr>
+                <w:b/>
+                <w:sz w:val="18"/>
+              </w:rPr>
+              <w:t>Completa técnicamente</w:t>
+            </w:r>
+          </w:p>
+        </w:tc>
+      </w:tr>
+    </w:tbl>
+    <w:p>
+      <w:pPr>
+        <w:pStyle w:val="Heading1"/>
+        <w:keepNext/>
+      </w:pPr>
+      <w:r>
+        <w:rPr>
+          <w:color w:val="123B63"/>
+        </w:rPr>
+        <w:t>2. Validación integral</w:t>
+      </w:r>
+    </w:p>
+    <w:p>
+      <w:pPr>
+        <w:pStyle w:val="ListBullet"/>
+      </w:pPr>
+      <w:r>
+        <w:t>Backend: 96 pruebas aprobadas, 0 fallidas y 0 omitidas.</w:t>
+      </w:r>
+    </w:p>
+    <w:p>
+      <w:pPr>
+        <w:pStyle w:val="ListBullet"/>
+      </w:pPr>
+      <w:r>
+        <w:t>Frontend: 156 pruebas aprobadas en 15 archivos.</w:t>
+      </w:r>
+    </w:p>
+    <w:p>
+      <w:pPr>
+        <w:pStyle w:val="ListBullet"/>
+      </w:pPr>
+      <w:r>
+        <w:t>E2E: 7 escenarios aprobados y 0 fallidos.</w:t>
+      </w:r>
+    </w:p>
+    <w:p>
+      <w:pPr>
+        <w:pStyle w:val="ListBullet"/>
+      </w:pPr>
+      <w:r>
+        <w:t>Compilación Angular de producción: aprobada.</w:t>
+      </w:r>
+    </w:p>
+    <w:p>
+      <w:pPr>
+        <w:pStyle w:val="ListBullet"/>
+      </w:pPr>
+      <w:r>
+        <w:t>Cobertura backend: líneas 20.56% y ramas 20.86%.</w:t>
+      </w:r>
+    </w:p>
+    <w:p>
+      <w:pPr>
+        <w:pStyle w:val="ListBullet"/>
+      </w:pPr>
+      <w:r>
+        <w:t>Cobertura frontend: sentencias 36.59%, ramas 30.24%, funciones 33.68% y líneas 37.06%.</w:t>
+      </w:r>
+    </w:p>
+    <w:p>
+      <w:pPr>
+        <w:pStyle w:val="Heading1"/>
+        <w:keepNext/>
+      </w:pPr>
+      <w:r>
+        <w:rPr>
+          <w:color w:val="123B63"/>
+        </w:rPr>
+        <w:t>3. Archivos oficiales validados</w:t>
+      </w:r>
+    </w:p>
+    <w:p>
+      <w:pPr>
+        <w:pStyle w:val="ListBullet"/>
+      </w:pPr>
+      <w:r>
+        <w:t>reporte_ejecutivo_matrices.pdf: PDF válido, 2 página(s), texto extraíble y checksum SHA-256 registrado.</w:t>
+      </w:r>
+    </w:p>
+    <w:p>
+      <w:pPr>
+        <w:pStyle w:val="ListBullet"/>
+      </w:pPr>
+      <w:r>
+        <w:t>reporte_matrices.xlsx: libro OpenXML válido con hojas Resumen, Matrices, Factores, Mapa transición, Matrices críticas, Planes y checksum SHA-256 registrado.</w:t>
+      </w:r>
+    </w:p>
+    <w:p>
+      <w:pPr>
+        <w:pStyle w:val="ListBullet"/>
+      </w:pPr>
+      <w:r>
+        <w:t>ficha_individual_matriz.pdf: PDF válido, 1 página(s), texto extraíble y checksum SHA-256 registrado.</w:t>
+      </w:r>
+    </w:p>
+    <w:p>
+      <w:r>
+        <w:rPr>
+          <w:b/>
+        </w:rPr>
+        <w:t xml:space="preserve">Criterio de cierre: </w:t>
+      </w:r>
+      <w:r>
+        <w:t>los archivos utilizados en esta validación fueron producidos por el renderer real del backend; no son plantillas HTML renombradas ni documentos generados localmente por Angular.</w:t>
+      </w:r>
+    </w:p>
+    <w:p>
+      <w:pPr>
+        <w:pStyle w:val="Heading1"/>
+        <w:keepNext/>
+      </w:pPr>
+      <w:r>
+        <w:rPr>
+          <w:color w:val="123B63"/>
+        </w:rPr>
+        <w:t>4. Validación Oracle</w:t>
+      </w:r>
+    </w:p>
+    <w:p>
+      <w:r>
+        <w:rPr>
+          <w:b/>
+        </w:rPr>
+        <w:t xml:space="preserve">Resultado: </w:t>
+      </w:r>
+      <w:r>
+        <w:t>Validación Oracle real no ejecutada en CI por ausencia de conectividad, credenciales y autorización institucional; dependencia externa documentada.</w:t>
+      </w:r>
+    </w:p>
+    <w:p>
+      <w:pPr>
+        <w:pStyle w:val="ListBullet"/>
+      </w:pPr>
+      <w:r>
+        <w:t>Se verificó la presencia e integridad de los scripts SQL de validación de la Fase 12.3.</w:t>
+      </w:r>
+    </w:p>
+    <w:p>
+      <w:pPr>
+        <w:pStyle w:val="ListBullet"/>
+      </w:pPr>
+      <w:r>
+        <w:t>Las pruebas de repositorio, aplicación y cálculo ejecutadas en CI aprobaron sin modificar el esquema Oracle.</w:t>
+      </w:r>
+    </w:p>
+    <w:p>
+      <w:pPr>
+        <w:pStyle w:val="ListBullet"/>
+      </w:pPr>
+      <w:r>
+        <w:t>La ejecución contra una instancia Oracle institucional real queda registrada como dependencia externa: requiere red, credenciales y autorización del IHSS.</w:t>
+      </w:r>
+    </w:p>
+    <w:p>
+      <w:pPr>
+        <w:pStyle w:val="Heading1"/>
+        <w:keepNext/>
+      </w:pPr>
+      <w:r>
+        <w:rPr>
+          <w:color w:val="123B63"/>
+        </w:rPr>
+        <w:t>5. Restricciones y arquitectura preservadas</w:t>
+      </w:r>
+    </w:p>
+    <w:p>
+      <w:pPr>
+        <w:pStyle w:val="ListBullet"/>
+      </w:pPr>
+      <w:r>
+        <w:t>No se modificó DNP</w:t>
+      </w:r>
+    </w:p>
+    <w:p>
+      <w:pPr>
+        <w:pStyle w:val="ListBullet"/>
+      </w:pPr>
+      <w:r>
+        <w:t>No se tocó CONTROL_ALMACEN.PROVEEDOR</w:t>
+      </w:r>
+    </w:p>
+    <w:p>
+      <w:pPr>
+        <w:pStyle w:val="ListBullet"/>
+      </w:pPr>
+      <w:r>
+        <w:t>No se integró funcionalmente Monitoreo de Listas con Matrices de Riesgos</w:t>
+      </w:r>
+    </w:p>
+    <w:p>
+      <w:pPr>
+        <w:pStyle w:val="ListBullet"/>
+      </w:pPr>
+      <w:r>
+        <w:t>No se modificó el motor de cálculo de riesgo</w:t>
+      </w:r>
+    </w:p>
+    <w:p>
+      <w:pPr>
+        <w:pStyle w:val="ListBullet"/>
+      </w:pPr>
+      <w:r>
+        <w:t>No se fusionó a main</w:t>
+      </w:r>
+    </w:p>
+    <w:p>
+      <w:pPr>
+        <w:pStyle w:val="Heading1"/>
+        <w:keepNext/>
+      </w:pPr>
+      <w:r>
+        <w:rPr>
+          <w:color w:val="123B63"/>
+        </w:rPr>
+        <w:t>6. Cierre técnico</w:t>
+      </w:r>
+    </w:p>
+    <w:p>
+      <w:r>
+        <w:rPr>
+          <w:b/>
+        </w:rPr>
+        <w:t xml:space="preserve">La Fase 12.5 queda técnicamente completada. </w:t>
+      </w:r>
+      <w:r>
+        <w:t>El Módulo de Matrices de Riesgos dispone de cálculo centralizado en backend, reportes oficiales PDF/XLSX, ficha individual, auditoría, controles UX y accesibilidad, pruebas automatizadas y evidencia de cierre. La integración a main continúa bloqueada hasta aprobación formal de Javier Mejía.</w:t>
+      </w:r>
+    </w:p>
+    <w:tbl>
+      <w:tblPr>
+        <w:tblStyle w:val="TableGrid"/>
+        <w:tblW w:type="auto" w:w="0"/>
+        <w:jc w:val="center"/>
+        <w:tblLook w:firstColumn="1" w:firstRow="1" w:lastColumn="0" w:lastRow="0" w:noHBand="0" w:noVBand="1" w:val="04A0"/>
+      </w:tblPr>
+      <w:tblGrid>
+        <w:gridCol w:w="5083"/>
+        <w:gridCol w:w="5083"/>
+      </w:tblGrid>
+      <w:tr>
+        <w:tc>
+          <w:tcPr>
+            <w:tcW w:type="dxa" w:w="5083"/>
+            <w:vAlign w:val="center"/>
+            <w:shd w:fill="E8EEF4"/>
+          </w:tcPr>
+          <w:p>
+            <w:r/>
+            <w:r>
+              <w:rPr>
+                <w:b/>
+                <w:sz w:val="18"/>
+              </w:rPr>
+              <w:t>Responsable de aprobación</w:t>
+            </w:r>
+          </w:p>
+        </w:tc>
+        <w:tc>
+          <w:tcPr>
+            <w:tcW w:type="dxa" w:w="5083"/>
+            <w:vAlign w:val="center"/>
+          </w:tcPr>
+          <w:p>
+            <w:r/>
+            <w:r>
+              <w:rPr>
+                <w:b w:val="0"/>
+                <w:sz w:val="18"/>
+              </w:rPr>
+              <w:t>Javier Mejía</w:t>
+            </w:r>
+          </w:p>
+        </w:tc>
+      </w:tr>
+      <w:tr>
+        <w:tc>
+          <w:tcPr>
+            <w:tcW w:type="dxa" w:w="5083"/>
+            <w:vAlign w:val="center"/>
+            <w:shd w:fill="E8EEF4"/>
+          </w:tcPr>
+          <w:p>
+            <w:r/>
+            <w:r>
+              <w:rPr>
+                <w:b/>
+                <w:sz w:val="18"/>
+              </w:rPr>
+              <w:t>Decisión</w:t>
+            </w:r>
+          </w:p>
+        </w:tc>
+        <w:tc>
+          <w:tcPr>
+            <w:tcW w:type="dxa" w:w="5083"/>
+            <w:vAlign w:val="center"/>
+          </w:tcPr>
+          <w:p>
+            <w:r/>
+            <w:r>
+              <w:rPr>
+                <w:b/>
+                <w:sz w:val="18"/>
+              </w:rPr>
+              <w:t>PENDIENTE DE APROBACIÓN FORMAL</w:t>
+            </w:r>
+          </w:p>
+        </w:tc>
+      </w:tr>
+      <w:tr>
+        <w:tc>
+          <w:tcPr>
+            <w:tcW w:type="dxa" w:w="5083"/>
+            <w:vAlign w:val="center"/>
+            <w:shd w:fill="E8EEF4"/>
+          </w:tcPr>
+          <w:p>
+            <w:r/>
+            <w:r>
+              <w:rPr>
+                <w:b/>
+                <w:sz w:val="18"/>
+              </w:rPr>
+              <w:t>Fecha</w:t>
+            </w:r>
+          </w:p>
+        </w:tc>
+        <w:tc>
+          <w:tcPr>
+            <w:tcW w:type="dxa" w:w="5083"/>
+            <w:vAlign w:val="center"/>
+          </w:tcPr>
+          <w:p>
+            <w:r/>
+            <w:r>
+              <w:rPr>
+                <w:b w:val="0"/>
+                <w:sz w:val="18"/>
+              </w:rPr>
+              <w:t>____________________________</w:t>
+            </w:r>
+          </w:p>
+        </w:tc>
+      </w:tr>
+      <w:tr>
+        <w:tc>
+          <w:tcPr>
+            <w:tcW w:type="dxa" w:w="5083"/>
+            <w:vAlign w:val="center"/>
+            <w:shd w:fill="E8EEF4"/>
+          </w:tcPr>
+          <w:p>
+            <w:r/>
+            <w:r>
+              <w:rPr>
+                <w:b/>
+                <w:sz w:val="18"/>
+              </w:rPr>
+              <w:t>Firma</w:t>
+            </w:r>
+          </w:p>
+        </w:tc>
+        <w:tc>
+          <w:tcPr>
+            <w:tcW w:type="dxa" w:w="5083"/>
+            <w:vAlign w:val="center"/>
+          </w:tcPr>
+          <w:p>
+            <w:r/>
+            <w:r>
+              <w:rPr>
+                <w:b w:val="0"/>
+                <w:sz w:val="18"/>
+              </w:rPr>
+              <w:t>____________________________</w:t>
+            </w:r>
+          </w:p>
+        </w:tc>
+      </w:tr>
+    </w:tbl>
     <w:sectPr>
       <w:headerReference w:type="default" r:id="rId9"/>
       <w:footerReference w:type="default" r:id="rId10"/>

</xml_diff>

<commit_message>
fix(matrices): completa control visual final fase 12.5.5
</commit_message>
<xml_diff>
--- a/docs/3. Módulo Matrices de Riesgos/Fase 12 - Mejora ejecutiva UXUI y mapa de calor/Cierre_Tecnico_Fase_12_Matrices_Riesgos_SGRLA_IHSS.docx
+++ b/docs/3. Módulo Matrices de Riesgos/Fase 12 - Mejora ejecutiva UXUI y mapa de calor/Cierre_Tecnico_Fase_12_Matrices_Riesgos_SGRLA_IHSS.docx
@@ -78,7 +78,9 @@
                 <w:color w:val="FFFFFF"/>
                 <w:sz w:val="44"/>
               </w:rPr>
-              <w:t>CIERRE TÉCNICO DE LA FASE 12</w:t>
+              <w:t>CIERRE TÉCNICO DE LA FASE 12 Y ACTUALIZACIÓN 12.5</w:t>
+              <w:br/>
+              <w:t>Mejora ejecutiva UX/UI, reportería institucional, pruebas y cierre definitivo</w:t>
             </w:r>
           </w:p>
           <w:p>
@@ -238,7 +240,7 @@
                 <w:color w:val="1F2937"/>
                 <w:sz w:val="18"/>
               </w:rPr>
-              <w:t>1.0</w:t>
+              <w:t>1.1</w:t>
             </w:r>
           </w:p>
         </w:tc>
@@ -297,7 +299,7 @@
                 <w:color w:val="1F2937"/>
                 <w:sz w:val="18"/>
               </w:rPr>
-              <w:t>21 de julio de 2026</w:t>
+              <w:t>22 de julio de 2026</w:t>
             </w:r>
           </w:p>
         </w:tc>
@@ -415,7 +417,7 @@
                 <w:color w:val="1F8A5B"/>
                 <w:sz w:val="18"/>
               </w:rPr>
-              <w:t>VALIDACIÓN TÉCNICA APROBADA - PENDIENTE APROBACIÓN FORMAL</w:t>
+              <w:t>CIERRE TÉCNICO APROBADO - PENDIENTE APROBACIÓN FORMAL</w:t>
             </w:r>
           </w:p>
         </w:tc>
@@ -479,6 +481,8 @@
                 <w:sz w:val="26"/>
               </w:rPr>
               <w:t>CONTROL DEL DOCUMENTO Y APROBACIÓN</w:t>
+              <w:br/>
+              <w:t>Documento maestro de cierre técnico de la Fase 12 y actualización final 12.5</w:t>
             </w:r>
           </w:p>
           <w:p>
@@ -726,7 +730,7 @@
                 <w:color w:val="1F2937"/>
                 <w:sz w:val="17"/>
               </w:rPr>
-              <w:t>Cierre Técnico Fase 12 - Matrices de Riesgos</w:t>
+              <w:t>Cierre Técnico Fase 12 y Actualización 12.5 - Matrices de Riesgos</w:t>
             </w:r>
           </w:p>
         </w:tc>
@@ -790,7 +794,7 @@
                 <w:color w:val="1F2937"/>
                 <w:sz w:val="17"/>
               </w:rPr>
-              <w:t>1.0</w:t>
+              <w:t>1.1</w:t>
             </w:r>
           </w:p>
         </w:tc>
@@ -856,7 +860,7 @@
                 <w:color w:val="1F2937"/>
                 <w:sz w:val="17"/>
               </w:rPr>
-              <w:t>21/07/2026</w:t>
+              <w:t>22/07/2026</w:t>
             </w:r>
           </w:p>
         </w:tc>
@@ -1116,7 +1120,7 @@
                 <w:color w:val="1F2937"/>
                 <w:sz w:val="17"/>
               </w:rPr>
-              <w:t>#2 - Fase 12 — Matrices de Riesgos técnicamente completada</w:t>
+              <w:t>#2 - Fase 12.5: estandarización institucional y refinamiento final</w:t>
             </w:r>
           </w:p>
         </w:tc>
@@ -1249,6 +1253,8 @@
                 <w:sz w:val="20"/>
               </w:rPr>
               <w:t>RESULTADO TÉCNICO</w:t>
+              <w:br/>
+              <w:t>La Fase 12 y su actualización 12.5 se encuentran técnicamente completas. El código, la reportería PDF/XLSX, la ficha individual, las pruebas automatizadas, la evidencia visual y el Documento Maestro han sido validados; la aprobación formal y el merge a main permanecen pendientes.</w:t>
             </w:r>
           </w:p>
           <w:p>
@@ -7223,7 +7229,7 @@
                 <w:color w:val="1F2937"/>
                 <w:sz w:val="16"/>
               </w:rPr>
-              <w:t>84</w:t>
+              <w:t>96</w:t>
             </w:r>
           </w:p>
         </w:tc>
@@ -7318,6 +7324,7 @@
                 <w:color w:val="1F2937"/>
                 <w:sz w:val="16"/>
               </w:rPr>
+              <w:t>APROBADO</w:t>
             </w:r>
             <w:r>
               <w:rPr>
@@ -7326,7 +7333,6 @@
                 <w:color w:val="FFFFFF"/>
                 <w:sz w:val="16"/>
               </w:rPr>
-              <w:t>APROBADO</w:t>
             </w:r>
           </w:p>
         </w:tc>
@@ -7392,7 +7398,7 @@
                 <w:color w:val="1F2937"/>
                 <w:sz w:val="16"/>
               </w:rPr>
-              <w:t>146</w:t>
+              <w:t>156</w:t>
             </w:r>
           </w:p>
         </w:tc>
@@ -7489,6 +7495,7 @@
                 <w:color w:val="1F2937"/>
                 <w:sz w:val="16"/>
               </w:rPr>
+              <w:t>APROBADO</w:t>
             </w:r>
             <w:r>
               <w:rPr>
@@ -7497,7 +7504,6 @@
                 <w:color w:val="FFFFFF"/>
                 <w:sz w:val="16"/>
               </w:rPr>
-              <w:t>APROBADO</w:t>
             </w:r>
           </w:p>
         </w:tc>
@@ -7561,7 +7567,7 @@
                 <w:color w:val="1F2937"/>
                 <w:sz w:val="16"/>
               </w:rPr>
-              <w:t>14</w:t>
+              <w:t>15</w:t>
             </w:r>
           </w:p>
         </w:tc>
@@ -7656,6 +7662,7 @@
                 <w:color w:val="1F2937"/>
                 <w:sz w:val="16"/>
               </w:rPr>
+              <w:t>APROBADO</w:t>
             </w:r>
             <w:r>
               <w:rPr>
@@ -7664,7 +7671,6 @@
                 <w:color w:val="FFFFFF"/>
                 <w:sz w:val="16"/>
               </w:rPr>
-              <w:t>APROBADO</w:t>
             </w:r>
           </w:p>
         </w:tc>
@@ -7827,6 +7833,7 @@
                 <w:color w:val="1F2937"/>
                 <w:sz w:val="16"/>
               </w:rPr>
+              <w:t>APROBADO</w:t>
             </w:r>
             <w:r>
               <w:rPr>
@@ -7835,7 +7842,6 @@
                 <w:color w:val="FFFFFF"/>
                 <w:sz w:val="16"/>
               </w:rPr>
-              <w:t>APROBADO</w:t>
             </w:r>
           </w:p>
         </w:tc>
@@ -7994,6 +8000,7 @@
                 <w:color w:val="1F2937"/>
                 <w:sz w:val="16"/>
               </w:rPr>
+              <w:t>APROBADO</w:t>
             </w:r>
             <w:r>
               <w:rPr>
@@ -8002,7 +8009,6 @@
                 <w:color w:val="FFFFFF"/>
                 <w:sz w:val="16"/>
               </w:rPr>
-              <w:t>APROBADO</w:t>
             </w:r>
           </w:p>
         </w:tc>
@@ -8036,7 +8042,7 @@
                 <w:color w:val="1F2937"/>
                 <w:sz w:val="16"/>
               </w:rPr>
-              <w:t>Quality Gates oficiales</w:t>
+              <w:t>Quality Gates finales</w:t>
             </w:r>
           </w:p>
         </w:tc>
@@ -8068,7 +8074,7 @@
                 <w:color w:val="1F2937"/>
                 <w:sz w:val="16"/>
               </w:rPr>
-              <w:t>Ejecución 29864022238</w:t>
+              <w:t>Ejecución 29955226359</w:t>
             </w:r>
           </w:p>
         </w:tc>
@@ -8165,6 +8171,7 @@
                 <w:color w:val="1F2937"/>
                 <w:sz w:val="16"/>
               </w:rPr>
+              <w:t>APROBADO</w:t>
             </w:r>
             <w:r>
               <w:rPr>
@@ -8173,7 +8180,6 @@
                 <w:color w:val="FFFFFF"/>
                 <w:sz w:val="16"/>
               </w:rPr>
-              <w:t>APROBADO</w:t>
             </w:r>
           </w:p>
         </w:tc>
@@ -8411,7 +8417,7 @@
                 <w:color w:val="1F2937"/>
                 <w:sz w:val="17"/>
               </w:rPr>
-              <w:t>15.44%</w:t>
+              <w:t>20.56%</w:t>
             </w:r>
           </w:p>
         </w:tc>
@@ -8509,7 +8515,7 @@
                 <w:color w:val="1F2937"/>
                 <w:sz w:val="17"/>
               </w:rPr>
-              <w:t>17.39%</w:t>
+              <w:t>20.86%</w:t>
             </w:r>
           </w:p>
         </w:tc>
@@ -8604,7 +8610,7 @@
                 <w:color w:val="1F2937"/>
                 <w:sz w:val="17"/>
               </w:rPr>
-              <w:t>32.53%</w:t>
+              <w:t>36.59%</w:t>
             </w:r>
           </w:p>
         </w:tc>
@@ -8702,7 +8708,7 @@
                 <w:color w:val="1F2937"/>
                 <w:sz w:val="17"/>
               </w:rPr>
-              <w:t>27.94%</w:t>
+              <w:t>30.24%</w:t>
             </w:r>
           </w:p>
         </w:tc>
@@ -8797,7 +8803,7 @@
                 <w:color w:val="1F2937"/>
                 <w:sz w:val="17"/>
               </w:rPr>
-              <w:t>31.66%</w:t>
+              <w:t>33.68%</w:t>
             </w:r>
           </w:p>
         </w:tc>
@@ -8895,7 +8901,7 @@
                 <w:color w:val="1F2937"/>
                 <w:sz w:val="17"/>
               </w:rPr>
-              <w:t>32.79%</w:t>
+              <w:t>37.06%</w:t>
             </w:r>
           </w:p>
         </w:tc>
@@ -9946,7 +9952,7 @@
           <w:sz w:val="19"/>
           <w:lang w:val="es-HN"/>
         </w:rPr>
-        <w:t>Los workflows de integración y scripts auxiliares utilizados para aplicar y validar la Fase 12.4 fueron retirados antes de publicar el commit productivo. El PR principal contiene únicamente código productivo, pruebas, documentación y evidencia funcional.</w:t>
+        <w:t>Los workflows de integración y scripts auxiliares utilizados para aplicar y validar las Fases 12.4 y 12.5 fueron retirados antes de publicar los commits productivos. El PR principal contiene únicamente código productivo, pruebas, documentación y evidencia funcional.</w:t>
       </w:r>
     </w:p>
     <w:p>
@@ -10219,7 +10225,7 @@
                 <w:color w:val="1F2937"/>
                 <w:sz w:val="15"/>
               </w:rPr>
-              <w:t>Commit funcional Fase 12.3</w:t>
+              <w:t>Estándar institucional 12.5.1</w:t>
             </w:r>
           </w:p>
         </w:tc>
@@ -10250,7 +10256,7 @@
                 <w:color w:val="1F2937"/>
                 <w:sz w:val="15"/>
               </w:rPr>
-              <w:t>ab019a9</w:t>
+              <w:t>526dbb6c70739531a465a2a752dc60ff88ef910f</w:t>
             </w:r>
           </w:p>
         </w:tc>
@@ -10281,7 +10287,7 @@
                 <w:color w:val="1F2937"/>
                 <w:sz w:val="15"/>
               </w:rPr>
-              <w:t>Cobertura total y paleta del mapa.</w:t>
+              <w:t>Inventario y estándar compartido.</w:t>
             </w:r>
           </w:p>
         </w:tc>
@@ -10315,7 +10321,7 @@
                 <w:color w:val="1F2937"/>
                 <w:sz w:val="15"/>
               </w:rPr>
-              <w:t>Commit de control 12.3</w:t>
+              <w:t>Normalización Monitoreo 12.5.2</w:t>
             </w:r>
           </w:p>
         </w:tc>
@@ -10347,7 +10353,7 @@
                 <w:color w:val="1F2937"/>
                 <w:sz w:val="15"/>
               </w:rPr>
-              <w:t>061290d</w:t>
+              <w:t>c17a7812ef1bdc7e895c10a3fc1ab1584398a7cc</w:t>
             </w:r>
           </w:p>
         </w:tc>
@@ -10379,7 +10385,7 @@
                 <w:color w:val="1F2937"/>
                 <w:sz w:val="15"/>
               </w:rPr>
-              <w:t>Control de cobertura y rama limpia.</w:t>
+              <w:t>PDF/XLSX institucionales en Monitoreo.</w:t>
             </w:r>
           </w:p>
         </w:tc>
@@ -10412,7 +10418,7 @@
                 <w:color w:val="1F2937"/>
                 <w:sz w:val="15"/>
               </w:rPr>
-              <w:t>Commit funcional Fase 12.4</w:t>
+              <w:t>Reportería Matrices 12.5.3</w:t>
             </w:r>
           </w:p>
         </w:tc>
@@ -10443,7 +10449,7 @@
                 <w:color w:val="1F2937"/>
                 <w:sz w:val="15"/>
               </w:rPr>
-              <w:t>135b8885a324c268686193525b70cb9f2bfec33a</w:t>
+              <w:t>42200b08a0c3a29669b446feddcffccc02d9831c</w:t>
             </w:r>
           </w:p>
         </w:tc>
@@ -10474,7 +10480,7 @@
                 <w:color w:val="1F2937"/>
                 <w:sz w:val="15"/>
               </w:rPr>
-              <w:t>Alineación de reportería y exportaciones.</w:t>
+              <w:t>PDF, ficha y XLSX generados en backend.</w:t>
             </w:r>
           </w:p>
         </w:tc>
@@ -10508,7 +10514,7 @@
                 <w:color w:val="1F2937"/>
                 <w:sz w:val="15"/>
               </w:rPr>
-              <w:t>Commit de evidencia</w:t>
+              <w:t>Refinamiento 12.5.4</w:t>
             </w:r>
           </w:p>
         </w:tc>
@@ -10540,7 +10546,7 @@
                 <w:color w:val="1F2937"/>
                 <w:sz w:val="15"/>
               </w:rPr>
-              <w:t>a4ad05843236d84d33c81ae1a07105ebf3f1e17a</w:t>
+              <w:t>0bdc15193a795046bd63d4a685f856f902e21337</w:t>
             </w:r>
           </w:p>
         </w:tc>
@@ -10572,7 +10578,7 @@
                 <w:color w:val="1F2937"/>
                 <w:sz w:val="15"/>
               </w:rPr>
-              <w:t>Registro de validación integral.</w:t>
+              <w:t>UX, accesibilidad y retiro seguro de /recalcular.</w:t>
             </w:r>
           </w:p>
         </w:tc>
@@ -10605,7 +10611,7 @@
                 <w:color w:val="1F2937"/>
                 <w:sz w:val="15"/>
               </w:rPr>
-              <w:t>Commit de cierre documental</w:t>
+              <w:t>Cierre técnico 12.5.5</w:t>
             </w:r>
           </w:p>
         </w:tc>
@@ -10636,7 +10642,7 @@
                 <w:color w:val="1F2937"/>
                 <w:sz w:val="15"/>
               </w:rPr>
-              <w:t>1fff981c01e0c5618d5de0d0db20a837e05df4b7</w:t>
+              <w:t>40bee949495785167f678e41ab929fba479b7814</w:t>
             </w:r>
           </w:p>
         </w:tc>
@@ -10667,7 +10673,7 @@
                 <w:color w:val="1F2937"/>
                 <w:sz w:val="15"/>
               </w:rPr>
-              <w:t>Consolidación del estado final.</w:t>
+              <w:t>Archivos reales, Documento Maestro y evidencia.</w:t>
             </w:r>
           </w:p>
         </w:tc>
@@ -10701,7 +10707,7 @@
                 <w:color w:val="1F2937"/>
                 <w:sz w:val="15"/>
               </w:rPr>
-              <w:t>Integración robusta</w:t>
+              <w:t>Ejecución controlada 12.5.5</w:t>
             </w:r>
           </w:p>
         </w:tc>
@@ -10733,7 +10739,7 @@
                 <w:color w:val="1F2937"/>
                 <w:sz w:val="15"/>
               </w:rPr>
-              <w:t>29863646296</w:t>
+              <w:t>29955226359</w:t>
             </w:r>
           </w:p>
         </w:tc>
@@ -10765,7 +10771,7 @@
                 <w:color w:val="1F2937"/>
                 <w:sz w:val="15"/>
               </w:rPr>
-              <w:t>Quality Gates aprobados y publicación limpia.</w:t>
+              <w:t>Quality Gates, build y render aprobados.</w:t>
             </w:r>
           </w:p>
         </w:tc>
@@ -10798,7 +10804,7 @@
                 <w:color w:val="1F2937"/>
                 <w:sz w:val="15"/>
               </w:rPr>
-              <w:t>Control oficial independiente</w:t>
+              <w:t>Evidencia final</w:t>
             </w:r>
           </w:p>
         </w:tc>
@@ -10829,7 +10835,7 @@
                 <w:color w:val="1F2937"/>
                 <w:sz w:val="15"/>
               </w:rPr>
-              <w:t>29864022238</w:t>
+              <w:t>Evidencia_Fase_12_5_5/fase12_5_5_cierre_definitivo.json</w:t>
             </w:r>
           </w:p>
         </w:tc>
@@ -10860,7 +10866,7 @@
                 <w:color w:val="1F2937"/>
                 <w:sz w:val="15"/>
               </w:rPr>
-              <w:t>Quality Gates aprobados sobre la rama final.</w:t>
+              <w:t>Métricas, checksums y limitación Oracle.</w:t>
             </w:r>
           </w:p>
         </w:tc>
@@ -10894,7 +10900,7 @@
                 <w:color w:val="1F2937"/>
                 <w:sz w:val="15"/>
               </w:rPr>
-              <w:t>Control final documental</w:t>
+              <w:t>Documento Maestro</w:t>
             </w:r>
           </w:p>
         </w:tc>
@@ -10926,7 +10932,7 @@
                 <w:color w:val="1F2937"/>
                 <w:sz w:val="15"/>
               </w:rPr>
-              <w:t>29864474534</w:t>
+              <w:t>Cierre_Tecnico_Fase_12_Matrices_Riesgos_SGRLA_IHSS.docx</w:t>
             </w:r>
           </w:p>
         </w:tc>
@@ -10958,7 +10964,7 @@
                 <w:color w:val="1F2937"/>
                 <w:sz w:val="15"/>
               </w:rPr>
-              <w:t>Quality Gates aprobados después del cierre documental.</w:t>
+              <w:t>Versión 1.1 con actualización 12.5.</w:t>
             </w:r>
           </w:p>
         </w:tc>
@@ -11053,7 +11059,7 @@
                 <w:color w:val="1F2937"/>
                 <w:sz w:val="15"/>
               </w:rPr>
-              <w:t>Permanece abierto, en borrador y sin merge.</w:t>
+              <w:t>Abierto, en borrador y sin merge a main.</w:t>
             </w:r>
           </w:p>
         </w:tc>
@@ -11119,7 +11125,7 @@
                 <w:color w:val="1F2937"/>
                 <w:sz w:val="15"/>
               </w:rPr>
-              <w:t>#3</w:t>
+              <w:t>#12</w:t>
             </w:r>
           </w:p>
         </w:tc>
@@ -11151,7 +11157,7 @@
                 <w:color w:val="1F2937"/>
                 <w:sz w:val="15"/>
               </w:rPr>
-              <w:t>Cerrado sin merge.</w:t>
+              <w:t>Ejecución controlada; cierre sin merge a main.</w:t>
             </w:r>
           </w:p>
         </w:tc>
@@ -11354,7 +11360,7 @@
                 <w:color w:val="1F2937"/>
                 <w:sz w:val="17"/>
               </w:rPr>
-              <w:t>Alcance funcional 12.1–12.4 implementado</w:t>
+              <w:t>Alcance de Fase 12 y actualización 12.5 implementado</w:t>
             </w:r>
           </w:p>
         </w:tc>
@@ -12284,6 +12290,8 @@
                 <w:sz w:val="20"/>
               </w:rPr>
               <w:t>RECOMENDACIÓN DE APROBACIÓN</w:t>
+              <w:br/>
+              <w:t>Aprobar formalmente la Fase 12 y su actualización 12.5 del Módulo Matrices de Riesgos. Como acción posterior e independiente, autorizar la integración del PR #2 a main únicamente después de verificar nuevamente sus controles.</w:t>
             </w:r>
           </w:p>
           <w:p>
@@ -12337,7 +12345,7 @@
           <w:sz w:val="19"/>
           <w:lang w:val="es-HN"/>
         </w:rPr>
-        <w:t>Con la evidencia técnica disponible, la Fase 12 queda declarada técnicamente completada. Esta declaración no equivale a una aprobación institucional ni autoriza por sí sola la fusión a main. La aprobación formal corresponde a Javier Mejía y a las instancias institucionales que apliquen.</w:t>
+        <w:t>Con la evidencia técnica disponible, la Fase 12 y su actualización 12.5 quedan declaradas técnicamente completadas. Esta declaración no equivale a una aprobación institucional ni autoriza por sí sola la fusión a main. La aprobación formal corresponde a Javier Mejía y a las instancias institucionales que apliquen.</w:t>
       </w:r>
     </w:p>
     <w:p>
@@ -12627,7 +12635,7 @@
           <w:sz w:val="18"/>
           <w:lang w:val="es-HN"/>
         </w:rPr>
-        <w:t>FIN DEL DOCUMENTO</w:t>
+        <w:t>ANEXO DE ACTUALIZACIÓN FINAL DE LA FASE 12.5 A CONTINUACIÓN</w:t>
       </w:r>
     </w:p>
     <w:p>

</xml_diff>

<commit_message>
fix(matrices): finaliza maquetación documental fase 12.5.5
</commit_message>
<xml_diff>
--- a/docs/3. Módulo Matrices de Riesgos/Fase 12 - Mejora ejecutiva UXUI y mapa de calor/Cierre_Tecnico_Fase_12_Matrices_Riesgos_SGRLA_IHSS.docx
+++ b/docs/3. Módulo Matrices de Riesgos/Fase 12 - Mejora ejecutiva UXUI y mapa de calor/Cierre_Tecnico_Fase_12_Matrices_Riesgos_SGRLA_IHSS.docx
@@ -83,19 +83,6 @@
               <w:t>Mejora ejecutiva UX/UI, reportería institucional, pruebas y cierre definitivo</w:t>
             </w:r>
           </w:p>
-          <w:p>
-            <w:pPr>
-              <w:jc w:val="center"/>
-            </w:pPr>
-            <w:r>
-              <w:rPr>
-                <w:rFonts w:ascii="Aptos" w:hAnsi="Aptos" w:eastAsia="Aptos"/>
-                <w:color w:val="DCE8F6"/>
-                <w:sz w:val="20"/>
-              </w:rPr>
-              <w:t>Mejora ejecutiva UX/UI, dashboard, mapa de calor, reportería y control de calidad</w:t>
-            </w:r>
-          </w:p>
         </w:tc>
       </w:tr>
     </w:tbl>
@@ -181,7 +168,7 @@
                 <w:color w:val="1F2937"/>
                 <w:sz w:val="18"/>
               </w:rPr>
-              <w:t>Cierre Técnico Fase 12 - Versión Única para Aprobación</w:t>
+              <w:t>Cierre Técnico Fase 12 y Actualización 12.5 - Versión Única para Aprobación</w:t>
             </w:r>
           </w:p>
         </w:tc>
@@ -483,16 +470,6 @@
               <w:t>CONTROL DEL DOCUMENTO Y APROBACIÓN</w:t>
               <w:br/>
               <w:t>Documento maestro de cierre técnico de la Fase 12 y actualización final 12.5</w:t>
-            </w:r>
-          </w:p>
-          <w:p>
-            <w:r>
-              <w:rPr>
-                <w:rFonts w:ascii="Aptos" w:hAnsi="Aptos" w:eastAsia="Aptos"/>
-                <w:color w:val="DCE8F6"/>
-                <w:sz w:val="17"/>
-              </w:rPr>
-              <w:t>Documento maestro de cierre técnico de la Fase 12</w:t>
             </w:r>
           </w:p>
         </w:tc>
@@ -1255,19 +1232,6 @@
               <w:t>RESULTADO TÉCNICO</w:t>
               <w:br/>
               <w:t>La Fase 12 y su actualización 12.5 se encuentran técnicamente completas. El código, la reportería PDF/XLSX, la ficha individual, las pruebas automatizadas, la evidencia visual y el Documento Maestro han sido validados; la aprobación formal y el merge a main permanecen pendientes.</w:t>
-            </w:r>
-          </w:p>
-          <w:p>
-            <w:pPr>
-              <w:spacing w:after="0"/>
-            </w:pPr>
-            <w:r>
-              <w:rPr>
-                <w:rFonts w:ascii="Aptos" w:hAnsi="Aptos" w:eastAsia="Aptos"/>
-                <w:color w:val="1F2937"/>
-                <w:sz w:val="18"/>
-              </w:rPr>
-              <w:t>La Fase 12 se encuentra técnicamente completa y validada. El código productivo, las pruebas automatizadas, el build Angular y los escenarios E2E aprobaron los Quality Gates. No se realizó fusión a main. El único paso pendiente es la aprobación formal de Javier Mejía y, posteriormente, la integración controlada del PR #2.</w:t>
             </w:r>
           </w:p>
         </w:tc>
@@ -11093,7 +11057,7 @@
                 <w:color w:val="1F2937"/>
                 <w:sz w:val="15"/>
               </w:rPr>
-              <w:t>PR técnico temporal</w:t>
+              <w:t>PR técnicos temporales</w:t>
             </w:r>
           </w:p>
         </w:tc>
@@ -11125,7 +11089,7 @@
                 <w:color w:val="1F2937"/>
                 <w:sz w:val="15"/>
               </w:rPr>
-              <w:t>#12</w:t>
+              <w:t>#12, #13 y #14</w:t>
             </w:r>
           </w:p>
         </w:tc>
@@ -11157,7 +11121,7 @@
                 <w:color w:val="1F2937"/>
                 <w:sz w:val="15"/>
               </w:rPr>
-              <w:t>Ejecución controlada; cierre sin merge a main.</w:t>
+              <w:t>Ejecución, control visual y maquetación final; cerrados sin merge a main.</w:t>
             </w:r>
           </w:p>
         </w:tc>
@@ -12292,19 +12256,6 @@
               <w:t>RECOMENDACIÓN DE APROBACIÓN</w:t>
               <w:br/>
               <w:t>Aprobar formalmente la Fase 12 y su actualización 12.5 del Módulo Matrices de Riesgos. Como acción posterior e independiente, autorizar la integración del PR #2 a main únicamente después de verificar nuevamente sus controles.</w:t>
-            </w:r>
-          </w:p>
-          <w:p>
-            <w:pPr>
-              <w:spacing w:after="0"/>
-            </w:pPr>
-            <w:r>
-              <w:rPr>
-                <w:rFonts w:ascii="Aptos" w:hAnsi="Aptos" w:eastAsia="Aptos"/>
-                <w:color w:val="1F2937"/>
-                <w:sz w:val="18"/>
-              </w:rPr>
-              <w:t>Aprobar formalmente la Fase 12 del Módulo Matrices de Riesgos y autorizar, como acción posterior e independiente, la integración controlada del PR #2 a main. Antes de fusionar, debe confirmarse que el PR continúa mergeable y que el último Quality Gate se mantiene aprobado.</w:t>
             </w:r>
           </w:p>
         </w:tc>
@@ -12422,7 +12373,7 @@
           <w:sz w:val="19"/>
           <w:lang w:val="es-HN"/>
         </w:rPr>
-        <w:t>Complete esta sección para autorizar o rechazar el cierre formal de la Fase 12. La aprobación constituye el requisito previo para integrar el PR #2 a main.</w:t>
+        <w:t>Complete esta sección para autorizar o rechazar el cierre formal de la Fase 12 y su actualización 12.5. La aprobación constituye el requisito previo para integrar el PR #2 a main.</w:t>
       </w:r>
     </w:p>
     <w:tbl>

</xml_diff>

<commit_message>
docs(matrices): cerrar formalmente fase 12
</commit_message>
<xml_diff>
--- a/docs/3. Módulo Matrices de Riesgos/Fase 12 - Mejora ejecutiva UXUI y mapa de calor/Cierre_Tecnico_Fase_12_Matrices_Riesgos_SGRLA_IHSS.docx
+++ b/docs/3. Módulo Matrices de Riesgos/Fase 12 - Mejora ejecutiva UXUI y mapa de calor/Cierre_Tecnico_Fase_12_Matrices_Riesgos_SGRLA_IHSS.docx
@@ -13351,6 +13351,247 @@
         </w:tc>
       </w:tr>
     </w:tbl>
+    <w:p>
+      <w:r>
+        <w:br w:type="page"/>
+      </w:r>
+    </w:p>
+    <w:p>
+      <w:pPr>
+        <w:pStyle w:val="Heading1"/>
+        <w:jc w:val="left"/>
+      </w:pPr>
+      <w:r>
+        <w:t>21. Cierre formal aprobado de Fase 12</w:t>
+      </w:r>
+    </w:p>
+    <w:p>
+      <w:r>
+        <w:rPr>
+          <w:b/>
+        </w:rPr>
+        <w:t>Estado final: Fase 12 aprobada y cerrada por autorización formal de Javier Mejía.</w:t>
+      </w:r>
+    </w:p>
+    <w:p>
+      <w:r>
+        <w:t>Fecha de aprobación: 29 de julio de 2026.</w:t>
+      </w:r>
+    </w:p>
+    <w:p>
+      <w:r>
+        <w:t>Rama validada: desarrollo.</w:t>
+      </w:r>
+    </w:p>
+    <w:p>
+      <w:r>
+        <w:t>Commit técnico validado previo al cierre: 945d369af485bca658735b48357cfa93279a250a.</w:t>
+      </w:r>
+    </w:p>
+    <w:p>
+      <w:r>
+        <w:t>Autorización adicional: integración controlada hacia main principal y publicación remota para dejar el repositorio local y GitHub en la misma versión.</w:t>
+      </w:r>
+    </w:p>
+    <w:p>
+      <w:pPr>
+        <w:pStyle w:val="Heading2"/>
+      </w:pPr>
+      <w:r>
+        <w:t>21.1 Validación técnica reproducida</w:t>
+      </w:r>
+    </w:p>
+    <w:tbl>
+      <w:tblPr>
+        <w:tblStyle w:val="TableGrid"/>
+        <w:tblW w:type="auto" w:w="0"/>
+        <w:jc w:val="center"/>
+        <w:tblLook w:firstColumn="1" w:firstRow="1" w:lastColumn="0" w:lastRow="0" w:noHBand="0" w:noVBand="1" w:val="04A0"/>
+      </w:tblPr>
+      <w:tblGrid>
+        <w:gridCol w:w="5083"/>
+        <w:gridCol w:w="5083"/>
+      </w:tblGrid>
+      <w:tr>
+        <w:tc>
+          <w:tcPr>
+            <w:tcW w:type="dxa" w:w="5083"/>
+          </w:tcPr>
+          <w:p>
+            <w:r>
+              <w:rPr>
+                <w:b/>
+              </w:rPr>
+              <w:t>Control</w:t>
+            </w:r>
+          </w:p>
+        </w:tc>
+        <w:tc>
+          <w:tcPr>
+            <w:tcW w:type="dxa" w:w="5083"/>
+          </w:tcPr>
+          <w:p>
+            <w:r>
+              <w:rPr>
+                <w:b/>
+              </w:rPr>
+              <w:t>Resultado</w:t>
+            </w:r>
+          </w:p>
+        </w:tc>
+      </w:tr>
+      <w:tr>
+        <w:tc>
+          <w:tcPr>
+            <w:tcW w:type="dxa" w:w="5083"/>
+            <w:vAlign w:val="center"/>
+          </w:tcPr>
+          <w:p>
+            <w:r>
+              <w:t>Backend restore, build y pruebas</w:t>
+            </w:r>
+          </w:p>
+        </w:tc>
+        <w:tc>
+          <w:tcPr>
+            <w:tcW w:type="dxa" w:w="5083"/>
+            <w:vAlign w:val="center"/>
+          </w:tcPr>
+          <w:p>
+            <w:r>
+              <w:t>Correcto. 96 pruebas aprobadas, 0 fallidas, 0 omitidas. Build con 0 errores y 2 advertencias xUnit2009 no bloqueantes.</w:t>
+            </w:r>
+          </w:p>
+        </w:tc>
+      </w:tr>
+      <w:tr>
+        <w:tc>
+          <w:tcPr>
+            <w:tcW w:type="dxa" w:w="5083"/>
+            <w:vAlign w:val="center"/>
+          </w:tcPr>
+          <w:p>
+            <w:r>
+              <w:t>Frontend build y pruebas</w:t>
+            </w:r>
+          </w:p>
+        </w:tc>
+        <w:tc>
+          <w:tcPr>
+            <w:tcW w:type="dxa" w:w="5083"/>
+            <w:vAlign w:val="center"/>
+          </w:tcPr>
+          <w:p>
+            <w:r>
+              <w:t>Correcto. Build Angular aprobado con advertencia conocida por exceljs CommonJS. 18 archivos de prueba aprobados, 165 pruebas aprobadas.</w:t>
+            </w:r>
+          </w:p>
+        </w:tc>
+      </w:tr>
+      <w:tr>
+        <w:tc>
+          <w:tcPr>
+            <w:tcW w:type="dxa" w:w="5083"/>
+            <w:vAlign w:val="center"/>
+          </w:tcPr>
+          <w:p>
+            <w:r>
+              <w:t>E2E</w:t>
+            </w:r>
+          </w:p>
+        </w:tc>
+        <w:tc>
+          <w:tcPr>
+            <w:tcW w:type="dxa" w:w="5083"/>
+            <w:vAlign w:val="center"/>
+          </w:tcPr>
+          <w:p>
+            <w:r>
+              <w:t>Correcto. 7 pruebas aprobadas.</w:t>
+            </w:r>
+          </w:p>
+        </w:tc>
+      </w:tr>
+      <w:tr>
+        <w:tc>
+          <w:tcPr>
+            <w:tcW w:type="dxa" w:w="5083"/>
+            <w:vAlign w:val="center"/>
+          </w:tcPr>
+          <w:p>
+            <w:r>
+              <w:t>Validadores PowerShell</w:t>
+            </w:r>
+          </w:p>
+        </w:tc>
+        <w:tc>
+          <w:tcPr>
+            <w:tcW w:type="dxa" w:w="5083"/>
+            <w:vAlign w:val="center"/>
+          </w:tcPr>
+          <w:p>
+            <w:r>
+              <w:t>Correctos: estructura, scripts Oracle, enlaces documentales y Quality Gates.</w:t>
+            </w:r>
+          </w:p>
+        </w:tc>
+      </w:tr>
+      <w:tr>
+        <w:tc>
+          <w:tcPr>
+            <w:tcW w:type="dxa" w:w="5083"/>
+            <w:vAlign w:val="center"/>
+          </w:tcPr>
+          <w:p>
+            <w:r>
+              <w:t>Restricciones funcionales</w:t>
+            </w:r>
+          </w:p>
+        </w:tc>
+        <w:tc>
+          <w:tcPr>
+            <w:tcW w:type="dxa" w:w="5083"/>
+            <w:vAlign w:val="center"/>
+          </w:tcPr>
+          <w:p>
+            <w:r>
+              <w:t>Sin cambios a DNP, CONTROL_ALMACEN.PROVEEDOR, permisos por módulo, motor de cálculo ni estructura Oracle.</w:t>
+            </w:r>
+          </w:p>
+        </w:tc>
+      </w:tr>
+    </w:tbl>
+    <w:p>
+      <w:pPr>
+        <w:pStyle w:val="Heading2"/>
+      </w:pPr>
+      <w:r>
+        <w:t>21.2 Decisión de cierre</w:t>
+      </w:r>
+    </w:p>
+    <w:p>
+      <w:r>
+        <w:t>Con la aprobación expresa de Javier Mejía, la Fase 12 queda cerrada formalmente. Las validaciones funcionales y visuales realizadas durante la fase, junto con la validación técnica reproducida, son aceptadas como evidencia suficiente para dar continuidad al repositorio principal.</w:t>
+      </w:r>
+    </w:p>
+    <w:p>
+      <w:r>
+        <w:t>Cualquier mejora posterior sobre Dashboard Ejecutivo, mapa de calor, reportes, Excel, PDF o experiencia de usuario deberá gestionarse como mantenimiento evolutivo o como nueva fase aprobada, sin reabrir la Fase 12.</w:t>
+      </w:r>
+    </w:p>
+    <w:p>
+      <w:pPr>
+        <w:pStyle w:val="Heading2"/>
+      </w:pPr>
+      <w:r>
+        <w:t>21.3 Condición posterior al merge</w:t>
+      </w:r>
+    </w:p>
+    <w:p>
+      <w:r>
+        <w:t>Después del merge autorizado hacia main, ambas ramas deberán quedar publicadas en GitHub. La rama desarrollo conserva el historial de trabajo activo y main queda como versión estable actualizada.</w:t>
+      </w:r>
+    </w:p>
     <w:sectPr>
       <w:headerReference w:type="default" r:id="rId9"/>
       <w:footerReference w:type="default" r:id="rId10"/>

</xml_diff>